<commit_message>
docs: assign named project roles in report outline
</commit_message>
<xml_diff>
--- a/docs/submission/初赛材料/给报告负责人的初赛文档框架.docx
+++ b/docs/submission/初赛材料/给报告负责人的初赛文档框架.docx
@@ -114,7 +114,7 @@
           <w:color w:val="000000"/>
           <w:sz w:val="21"/>
         </w:rPr>
-        <w:t>下表是根据现有五人分工确定的报告角色安排。请把方括号替换为报名表中的姓名与学号，并在定稿前核对实际贡献。组长同时负责系统开发和总体协调，因此建议兼任项目经理与技术经理。</w:t>
+        <w:t>徐介翰是已确定的组长，建议在报告中担任项目经理兼技术经理。其余四人的项目岗位按现有任务安排提出，定稿前请按实际贡献核对；学号仍需按报名表补齐。PPT、视频和文稿属于交付任务，不作为项目岗位名称。</w:t>
       </w:r>
     </w:p>
     <w:tbl>
@@ -188,7 +188,7 @@
                 <w:color w:val="FFFFFF"/>
                 <w:sz w:val="19"/>
               </w:rPr>
-              <w:t>报告中的角色</w:t>
+              <w:t>项目岗位</w:t>
             </w:r>
           </w:p>
         </w:tc>
@@ -216,7 +216,7 @@
                 <w:color w:val="FFFFFF"/>
                 <w:sz w:val="19"/>
               </w:rPr>
-              <w:t>实际责任</w:t>
+              <w:t>项目职责</w:t>
             </w:r>
           </w:p>
         </w:tc>
@@ -244,7 +244,7 @@
                 <w:color w:val="FFFFFF"/>
                 <w:sz w:val="19"/>
               </w:rPr>
-              <w:t>交付给主笔的内容</w:t>
+              <w:t>提供给报告主笔的事实</w:t>
             </w:r>
           </w:p>
         </w:tc>
@@ -276,7 +276,7 @@
                 <w:color w:val="000000"/>
                 <w:sz w:val="18"/>
               </w:rPr>
-              <w:t>组长［姓名 学号］</w:t>
+              <w:t>徐介翰［学号待填］</w:t>
             </w:r>
           </w:p>
         </w:tc>
@@ -330,7 +330,7 @@
                 <w:color w:val="000000"/>
                 <w:sz w:val="18"/>
               </w:rPr>
-              <w:t>进度与版本决策；系统研发；技术路线和真实功能验收</w:t>
+              <w:t>项目计划、版本决策、系统研发、技术架构和功能验收</w:t>
             </w:r>
           </w:p>
         </w:tc>
@@ -357,7 +357,7 @@
                 <w:color w:val="000000"/>
                 <w:sz w:val="18"/>
               </w:rPr>
-              <w:t>项目定位、S2B 过程记录、S2C 架构与技术事实、演示账号及截图</w:t>
+              <w:t>项目定位、S2B 过程记录、S2C 技术事实、真实截图和演示环境</w:t>
             </w:r>
           </w:p>
         </w:tc>
@@ -390,7 +390,7 @@
                 <w:color w:val="000000"/>
                 <w:sz w:val="18"/>
               </w:rPr>
-              <w:t>成员二［姓名 学号］</w:t>
+              <w:t>孙竞杰［学号待填］</w:t>
             </w:r>
           </w:p>
         </w:tc>
@@ -418,7 +418,7 @@
                 <w:color w:val="000000"/>
                 <w:sz w:val="18"/>
               </w:rPr>
-              <w:t>客户关系与商业分析负责人；报告主笔</w:t>
+              <w:t>产品经理</w:t>
             </w:r>
           </w:p>
         </w:tc>
@@ -446,7 +446,7 @@
                 <w:color w:val="000000"/>
                 <w:sz w:val="18"/>
               </w:rPr>
-              <w:t>形成 S1、S2 和企业专项文档；统一术语与图文</w:t>
+              <w:t>用户需求、功能范围、使用流程、交互验收和产品价值</w:t>
             </w:r>
           </w:p>
         </w:tc>
@@ -474,7 +474,7 @@
                 <w:color w:val="000000"/>
                 <w:sz w:val="18"/>
               </w:rPr>
-              <w:t>报告正文、S2A 用户价值、S2D 成本可行性与汇总稿</w:t>
+              <w:t>S2A 用户场景、服务流程、使用手册和产品界面说明</w:t>
             </w:r>
           </w:p>
         </w:tc>
@@ -506,7 +506,7 @@
                 <w:color w:val="000000"/>
                 <w:sz w:val="18"/>
               </w:rPr>
-              <w:t>成员三［姓名 学号］</w:t>
+              <w:t>马星宇［学号待填］</w:t>
             </w:r>
           </w:p>
         </w:tc>
@@ -533,7 +533,7 @@
                 <w:color w:val="000000"/>
                 <w:sz w:val="18"/>
               </w:rPr>
-              <w:t>产品表达与 PPT 内容负责人</w:t>
+              <w:t>业务分析经理</w:t>
             </w:r>
           </w:p>
         </w:tc>
@@ -560,7 +560,7 @@
                 <w:color w:val="000000"/>
                 <w:sz w:val="18"/>
               </w:rPr>
-              <w:t>十分钟叙事、逐页讲稿、核心价值和产品流程</w:t>
+              <w:t>制造业务场景、指标口径、服务模式和成本假设</w:t>
             </w:r>
           </w:p>
         </w:tc>
@@ -587,7 +587,7 @@
                 <w:color w:val="000000"/>
                 <w:sz w:val="18"/>
               </w:rPr>
-              <w:t>S3 文案、用户旅程、S5 个人过程记录</w:t>
+              <w:t>业务知识、典型案例、S2D 成本与可行性资料</w:t>
             </w:r>
           </w:p>
         </w:tc>
@@ -620,7 +620,7 @@
                 <w:color w:val="000000"/>
                 <w:sz w:val="18"/>
               </w:rPr>
-              <w:t>成员四［姓名 学号］</w:t>
+              <w:t>陈庚琦［学号待填］</w:t>
             </w:r>
           </w:p>
         </w:tc>
@@ -648,7 +648,7 @@
                 <w:color w:val="000000"/>
                 <w:sz w:val="18"/>
               </w:rPr>
-              <w:t>视觉呈现与 PPT 制作负责人</w:t>
+              <w:t>交互设计经理</w:t>
             </w:r>
           </w:p>
         </w:tc>
@@ -676,7 +676,7 @@
                 <w:color w:val="000000"/>
                 <w:sz w:val="18"/>
               </w:rPr>
-              <w:t>统一版式、架构图、产品截图排版与 PPT 成稿</w:t>
+              <w:t>用户操作路径、分析结果呈现、信息层级与展示一致性</w:t>
             </w:r>
           </w:p>
         </w:tc>
@@ -704,7 +704,7 @@
                 <w:color w:val="000000"/>
                 <w:sz w:val="18"/>
               </w:rPr>
-              <w:t>正式 PPT、可复用图表及图源记录</w:t>
+              <w:t>交互流程图、页面图示、产品效果与图源说明</w:t>
             </w:r>
           </w:p>
         </w:tc>
@@ -736,7 +736,7 @@
                 <w:color w:val="000000"/>
                 <w:sz w:val="18"/>
               </w:rPr>
-              <w:t>成员五［姓名 学号］</w:t>
+              <w:t>代洛瑞［学号待填］</w:t>
             </w:r>
           </w:p>
         </w:tc>
@@ -763,7 +763,7 @@
                 <w:color w:val="000000"/>
                 <w:sz w:val="18"/>
               </w:rPr>
-              <w:t>演示与测试负责人</w:t>
+              <w:t>测试与交付经理</w:t>
             </w:r>
           </w:p>
         </w:tc>
@@ -790,7 +790,7 @@
                 <w:color w:val="000000"/>
                 <w:sz w:val="18"/>
               </w:rPr>
-              <w:t>实机录屏、剪辑、字幕、演示复核与视频压缩</w:t>
+              <w:t>演示场景验证、问题记录、发布检查和交付质量</w:t>
             </w:r>
           </w:p>
         </w:tc>
@@ -817,7 +817,7 @@
                 <w:color w:val="000000"/>
                 <w:sz w:val="18"/>
               </w:rPr>
-              <w:t>S4 演示视频、操作步骤、测试问题和 S5 过程记录</w:t>
+              <w:t>稳定演示步骤、测试结果、视频素材与交付记录</w:t>
             </w:r>
           </w:p>
         </w:tc>
@@ -848,7 +848,7 @@
           <w:color w:val="000000"/>
           <w:sz w:val="21"/>
         </w:rPr>
-        <w:t>S2A 由报告主笔牵头，S2B 由项目经理提供事实，S2C 由技术经理提供事实，S2D 由客户关系与商业分析负责人牵头。报告主笔负责文字整合，事实提供人负责核对。</w:t>
+        <w:t>S2A 由产品经理提供需求与流程，S2B 由项目经理提供组织与过程，S2C 由技术经理提供架构与实现，S2D 由业务分析经理提供成本与可行性。负责文稿的同学负责文字整合，各岗位核对自己提供的事实。</w:t>
       </w:r>
     </w:p>
     <w:p>
@@ -1039,7 +1039,7 @@
           <w:color w:val="000000"/>
           <w:sz w:val="21"/>
         </w:rPr>
-        <w:t>组织结构：使用第一节的五人角色表，写清项目经理、技术经理、客户关系与商业分析负责人、PPT 两位负责人和演示测试负责人。</w:t>
+        <w:t>组织结构：使用第一节的五人岗位表，写清项目经理、技术经理、产品经理、业务分析经理、交互设计经理和测试与交付经理及兼任关系。</w:t>
       </w:r>
     </w:p>
     <w:p>
@@ -1550,7 +1550,7 @@
                 <w:color w:val="000000"/>
                 <w:sz w:val="18"/>
               </w:rPr>
-              <w:t>两位 PPT 负责人</w:t>
+              <w:t>产品经理与交互设计经理</w:t>
             </w:r>
           </w:p>
         </w:tc>
@@ -1639,7 +1639,7 @@
                 <w:color w:val="000000"/>
                 <w:sz w:val="18"/>
               </w:rPr>
-              <w:t>组长与演示负责人</w:t>
+              <w:t>项目经理与测试交付经理</w:t>
             </w:r>
           </w:p>
         </w:tc>
@@ -1725,7 +1725,7 @@
                 <w:color w:val="000000"/>
                 <w:sz w:val="18"/>
               </w:rPr>
-              <w:t>演示负责人</w:t>
+              <w:t>测试与交付经理</w:t>
             </w:r>
           </w:p>
         </w:tc>
@@ -1814,7 +1814,7 @@
                 <w:color w:val="000000"/>
                 <w:sz w:val="18"/>
               </w:rPr>
-              <w:t>全员过程证据；PPT 内容负责人汇总</w:t>
+              <w:t>项目经理汇总全员过程证据</w:t>
             </w:r>
           </w:p>
         </w:tc>
@@ -1900,7 +1900,7 @@
                 <w:color w:val="000000"/>
                 <w:sz w:val="18"/>
               </w:rPr>
-              <w:t>主笔整合；组长和各责任人供事实</w:t>
+              <w:t>文稿同学整合；各项目岗位提供事实</w:t>
             </w:r>
           </w:p>
         </w:tc>

</xml_diff>